<commit_message>
Synchronize project documentation and validation contracts
</commit_message>
<xml_diff>
--- a/docs/shumeyko-partners-wb-unit-economics-client-tz.docx
+++ b/docs/shumeyko-partners-wb-unit-economics-client-tz.docx
@@ -57,7 +57,7 @@
         <w:rPr>
           <w:rFonts w:ascii="Geologica" w:hAnsi="Geologica" w:eastAsia="Geologica"/>
         </w:rPr>
-        <w:t>Дата актуализации: 10 июля 2026.</w:t>
+        <w:t>Дата актуализации: 13 июля 2026.</w:t>
       </w:r>
     </w:p>
     <w:p>
@@ -1001,7 +1001,7 @@
         <w:rPr>
           <w:rFonts w:ascii="Geologica" w:hAnsi="Geologica" w:eastAsia="Geologica"/>
         </w:rPr>
-        <w:t>отклоняет спорные строки. По умолчанию первый кабинет WB связан с первой</w:t>
+        <w:t>отклоняет спорные строки. Кабинет WB связывается с организацией 1С только через</w:t>
       </w:r>
     </w:p>
     <w:p>
@@ -1009,7 +1009,7 @@
         <w:rPr>
           <w:rFonts w:ascii="Geologica" w:hAnsi="Geologica" w:eastAsia="Geologica"/>
         </w:rPr>
-        <w:t>организацией 1С, второй кабинет WB связан со второй организацией 1С. Эту связку</w:t>
+        <w:t>явные стабильные идентификаторы `wb_cabinet_id` и `client_company_id`.</w:t>
       </w:r>
     </w:p>
     <w:p>
@@ -1017,7 +1017,23 @@
         <w:rPr>
           <w:rFonts w:ascii="Geologica" w:hAnsi="Geologica" w:eastAsia="Geologica"/>
         </w:rPr>
-        <w:t>можно переопределить конфигурацией.</w:t>
+        <w:t>Автоматический выбор пары по порядку кабинетов и организаций запрещен. Несовпадение</w:t>
+      </w:r>
+    </w:p>
+    <w:p>
+      <w:r>
+        <w:rPr>
+          <w:rFonts w:ascii="Geologica" w:hAnsi="Geologica" w:eastAsia="Geologica"/>
+        </w:rPr>
+        <w:t>организации строки отчета и организации кабинета является непереопределяемым</w:t>
+      </w:r>
+    </w:p>
+    <w:p>
+      <w:r>
+        <w:rPr>
+          <w:rFonts w:ascii="Geologica" w:hAnsi="Geologica" w:eastAsia="Geologica"/>
+        </w:rPr>
+        <w:t>блокером публикации.</w:t>
       </w:r>
     </w:p>
     <w:p>
@@ -1269,7 +1285,7 @@
         <w:rPr>
           <w:rFonts w:ascii="Geologica" w:hAnsi="Geologica" w:eastAsia="Geologica"/>
         </w:rPr>
-        <w:t>ОСНО отдельно показываются `НДС к уплате`, налог на прибыль и `прибыль до</w:t>
+        <w:t>ОСНО отдельно показываются `НДС к уплате`, применимые налоги на доход, кроме</w:t>
       </w:r>
     </w:p>
     <w:p>
@@ -1277,7 +1293,23 @@
         <w:rPr>
           <w:rFonts w:ascii="Geologica" w:hAnsi="Geologica" w:eastAsia="Geologica"/>
         </w:rPr>
-        <w:t>НДФЛ`. Если профиль, ставка или обязательный источник не подтверждены,</w:t>
+        <w:t>НДФЛ предпринимателя, и `прибыль до НДФЛ`. В текущей методике ИП ОСНО</w:t>
+      </w:r>
+    </w:p>
+    <w:p>
+      <w:r>
+        <w:rPr>
+          <w:rFonts w:ascii="Geologica" w:hAnsi="Geologica" w:eastAsia="Geologica"/>
+        </w:rPr>
+        <w:t>ненДФЛ-налог равен нулю, а НДФЛ по SKU не распределяется. Если профиль, ставка</w:t>
+      </w:r>
+    </w:p>
+    <w:p>
+      <w:r>
+        <w:rPr>
+          <w:rFonts w:ascii="Geologica" w:hAnsi="Geologica" w:eastAsia="Geologica"/>
+        </w:rPr>
+        <w:t>или обязательный источник не подтверждены,</w:t>
       </w:r>
     </w:p>
     <w:p>

</xml_diff>

<commit_message>
Load organization tax profiles from 1C settings
</commit_message>
<xml_diff>
--- a/docs/shumeyko-partners-wb-unit-economics-client-tz.docx
+++ b/docs/shumeyko-partners-wb-unit-economics-client-tz.docx
@@ -57,7 +57,7 @@
         <w:rPr>
           <w:rFonts w:ascii="Geologica" w:hAnsi="Geologica" w:eastAsia="Geologica"/>
         </w:rPr>
-        <w:t>Дата актуализации: 17 июля 2026.</w:t>
+        <w:t>Дата актуализации: 21 июля 2026.</w:t>
       </w:r>
     </w:p>
     <w:p>
@@ -1278,6 +1278,38 @@
           <w:rFonts w:ascii="Geologica" w:hAnsi="Geologica" w:eastAsia="Geologica"/>
         </w:rPr>
         <w:t>Налоговый слой считается только по подтвержденному профилю организации 1С. Для</w:t>
+      </w:r>
+    </w:p>
+    <w:p>
+      <w:r>
+        <w:rPr>
+          <w:rFonts w:ascii="Geologica" w:hAnsi="Geologica" w:eastAsia="Geologica"/>
+        </w:rPr>
+        <w:t>каждой организации профиль выбирается из действующих на дату отчёта настроек</w:t>
+      </w:r>
+    </w:p>
+    <w:p>
+      <w:r>
+        <w:rPr>
+          <w:rFonts w:ascii="Geologica" w:hAnsi="Geologica" w:eastAsia="Geologica"/>
+        </w:rPr>
+        <w:t>системы налогообложения и НДС в 1С. Профиль УСН «доходы минус расходы»</w:t>
+      </w:r>
+    </w:p>
+    <w:p>
+      <w:r>
+        <w:rPr>
+          <w:rFonts w:ascii="Geologica" w:hAnsi="Geologica" w:eastAsia="Geologica"/>
+        </w:rPr>
+        <w:t>показывается, но до принятия отдельной формулы налог не считается процентом от</w:t>
+      </w:r>
+    </w:p>
+    <w:p>
+      <w:r>
+        <w:rPr>
+          <w:rFonts w:ascii="Geologica" w:hAnsi="Geologica" w:eastAsia="Geologica"/>
+        </w:rPr>
+        <w:t>выручки. Для</w:t>
       </w:r>
     </w:p>
     <w:p>

</xml_diff>

<commit_message>
Use stock register fallback for missing 1C costs
</commit_message>
<xml_diff>
--- a/docs/shumeyko-partners-wb-unit-economics-client-tz.docx
+++ b/docs/shumeyko-partners-wb-unit-economics-client-tz.docx
@@ -57,7 +57,7 @@
         <w:rPr>
           <w:rFonts w:ascii="Geologica" w:hAnsi="Geologica" w:eastAsia="Geologica"/>
         </w:rPr>
-        <w:t>Дата актуализации: 21 июля 2026.</w:t>
+        <w:t>Дата актуализации: 24 июля 2026.</w:t>
       </w:r>
     </w:p>
     <w:p>
@@ -678,6 +678,54 @@
           <w:rFonts w:ascii="Geologica" w:hAnsi="Geologica" w:eastAsia="Geologica"/>
         </w:rPr>
         <w:t>поля для формирования кандидатов сопоставления товаров WB и 1С.</w:t>
+      </w:r>
+    </w:p>
+    <w:p>
+      <w:r>
+        <w:rPr>
+          <w:rFonts w:ascii="Geologica" w:hAnsi="Geologica" w:eastAsia="Geologica"/>
+        </w:rPr>
+        <w:t>Основной источник себестоимости — регистр `Продажи`. Если по организации и</w:t>
+      </w:r>
+    </w:p>
+    <w:p>
+      <w:r>
+        <w:rPr>
+          <w:rFonts w:ascii="Geologica" w:hAnsi="Geologica" w:eastAsia="Geologica"/>
+        </w:rPr>
+        <w:t>товару в нем нет ни одной ненулевой себестоимости, сервис использует резервную</w:t>
+      </w:r>
+    </w:p>
+    <w:p>
+      <w:r>
+        <w:rPr>
+          <w:rFonts w:ascii="Geologica" w:hAnsi="Geologica" w:eastAsia="Geologica"/>
+        </w:rPr>
+        <w:t>фиксированную приходную строку регистра `Запасы` со стоимостью единицы</w:t>
+      </w:r>
+    </w:p>
+    <w:p>
+      <w:r>
+        <w:rPr>
+          <w:rFonts w:ascii="Geologica" w:hAnsi="Geologica" w:eastAsia="Geologica"/>
+        </w:rPr>
+        <w:t>`Сумма / Количество`. Такой резервный расчет всегда помечается</w:t>
+      </w:r>
+    </w:p>
+    <w:p>
+      <w:r>
+        <w:rPr>
+          <w:rFonts w:ascii="Geologica" w:hAnsi="Geologica" w:eastAsia="Geologica"/>
+        </w:rPr>
+        <w:t>`Себестоимость 1С требует сверки`; найденную ненулевую стоимость из `Продаж`</w:t>
+      </w:r>
+    </w:p>
+    <w:p>
+      <w:r>
+        <w:rPr>
+          <w:rFonts w:ascii="Geologica" w:hAnsi="Geologica" w:eastAsia="Geologica"/>
+        </w:rPr>
+        <w:t>он не заменяет.</w:t>
       </w:r>
     </w:p>
     <w:p>

</xml_diff>